<commit_message>
muutettu tietokantakuvausta ja Keikkatyölaskutusjärjestelmä.doc:ia
</commit_message>
<xml_diff>
--- a/docs/Keikkatyölaskutusjärjestelmä.docx
+++ b/docs/Keikkatyölaskutusjärjestelmä.docx
@@ -3,11 +3,9 @@
 <w:document xmlns:wpc="http://schemas.microsoft.com/office/word/2010/wordprocessingCanvas" xmlns:cx="http://schemas.microsoft.com/office/drawing/2014/chartex" xmlns:cx1="http://schemas.microsoft.com/office/drawing/2015/9/8/chartex" xmlns:cx2="http://schemas.microsoft.com/office/drawing/2015/10/21/chartex" xmlns:cx3="http://schemas.microsoft.com/office/drawing/2016/5/9/chartex" xmlns:cx4="http://schemas.microsoft.com/office/drawing/2016/5/10/chartex" xmlns:cx5="http://schemas.microsoft.com/office/drawing/2016/5/11/chartex" xmlns:cx6="http://schemas.microsoft.com/office/drawing/2016/5/12/chartex" xmlns:cx7="http://schemas.microsoft.com/office/drawing/2016/5/13/chartex" xmlns:cx8="http://schemas.microsoft.com/office/drawing/2016/5/14/chartex" xmlns:mc="http://schemas.openxmlformats.org/markup-compatibility/2006" xmlns:aink="http://schemas.microsoft.com/office/drawing/2016/ink" xmlns:am3d="http://schemas.microsoft.com/office/drawing/2017/model3d" xmlns:o="urn:schemas-microsoft-com:office:office" xmlns:oel="http://schemas.microsoft.com/office/2019/extlst" xmlns:r="http://schemas.openxmlformats.org/officeDocument/2006/relationships" xmlns:m="http://schemas.openxmlformats.org/officeDocument/2006/math" xmlns:v="urn:schemas-microsoft-com:vml" xmlns:wp14="http://schemas.microsoft.com/office/word/2010/wordprocessingDrawing" xmlns:wp="http://schemas.openxmlformats.org/drawingml/2006/wordprocessingDrawing" xmlns:w10="urn:schemas-microsoft-com:office:word" xmlns:w="http://schemas.openxmlformats.org/wordprocessingml/2006/main" xmlns:w14="http://schemas.microsoft.com/office/word/2010/wordml" xmlns:w15="http://schemas.microsoft.com/office/word/2012/wordml" xmlns:w16cex="http://schemas.microsoft.com/office/word/2018/wordml/cex" xmlns:w16cid="http://schemas.microsoft.com/office/word/2016/wordml/cid" xmlns:w16="http://schemas.microsoft.com/office/word/2018/wordml" xmlns:w16du="http://schemas.microsoft.com/office/word/2023/wordml/word16du" xmlns:w16sdtdh="http://schemas.microsoft.com/office/word/2020/wordml/sdtdatahash" xmlns:w16sdtfl="http://schemas.microsoft.com/office/word/2024/wordml/sdtformatlock" xmlns:w16se="http://schemas.microsoft.com/office/word/2015/wordml/symex" xmlns:wpg="http://schemas.microsoft.com/office/word/2010/wordprocessingGroup" xmlns:wpi="http://schemas.microsoft.com/office/word/2010/wordprocessingInk" xmlns:wne="http://schemas.microsoft.com/office/word/2006/wordml" xmlns:wps="http://schemas.microsoft.com/office/word/2010/wordprocessingShape" mc:Ignorable="w14 w15 w16se w16cid w16 w16cex w16sdtdh w16sdtfl w16du wp14">
   <w:body>
     <w:p>
-      <w:proofErr w:type="spellStart"/>
       <w:r>
         <w:t>Keikkatyölaskutusohjelma</w:t>
       </w:r>
-      <w:proofErr w:type="spellEnd"/>
       <w:r>
         <w:t xml:space="preserve"> lyhyesti</w:t>
       </w:r>
@@ -23,11 +21,9 @@
           <w:numId w:val="1"/>
         </w:numPr>
       </w:pPr>
-      <w:proofErr w:type="spellStart"/>
       <w:r>
         <w:t>Keikkatyölaskutusohjelman</w:t>
       </w:r>
-      <w:proofErr w:type="spellEnd"/>
       <w:r>
         <w:t xml:space="preserve"> käyttö ja</w:t>
       </w:r>
@@ -239,15 +235,7 @@
         </w:numPr>
       </w:pPr>
       <w:r>
-        <w:t xml:space="preserve">palkkiosta ei peritä </w:t>
-      </w:r>
-      <w:proofErr w:type="spellStart"/>
-      <w:r>
-        <w:t>TyEL-</w:t>
-      </w:r>
-      <w:proofErr w:type="spellEnd"/>
-      <w:r>
-        <w:t xml:space="preserve"> eikä työttömyysvakuutusmaksuja</w:t>
+        <w:t>palkkiosta ei peritä TyEL- eikä työttömyysvakuutusmaksuja</w:t>
       </w:r>
     </w:p>
     <w:p>
@@ -533,13 +521,8 @@
         </w:numPr>
       </w:pPr>
       <w:r>
-        <w:t xml:space="preserve">verokortin jäljennös </w:t>
-      </w:r>
-      <w:proofErr w:type="spellStart"/>
-      <w:r>
-        <w:t>pdf:nä</w:t>
-      </w:r>
-      <w:proofErr w:type="spellEnd"/>
+        <w:t>verokortin jäljennös pdf:nä</w:t>
+      </w:r>
       <w:r>
         <w:t xml:space="preserve"> tai kuvana (jpg, png)</w:t>
       </w:r>
@@ -2382,6 +2365,73 @@
       <w:r>
         <w:t>tiedot: ks. kohta 1.3. laskutustoimeksianto</w:t>
       </w:r>
+    </w:p>
+    <w:p>
+      <w:pPr>
+        <w:pStyle w:val="Luettelokappale"/>
+        <w:numPr>
+          <w:ilvl w:val="2"/>
+          <w:numId w:val="1"/>
+        </w:numPr>
+      </w:pPr>
+      <w:r>
+        <w:t>Suomen ALV-kannat (2026):</w:t>
+      </w:r>
+    </w:p>
+    <w:p>
+      <w:pPr>
+        <w:pStyle w:val="Luettelokappale"/>
+        <w:numPr>
+          <w:ilvl w:val="3"/>
+          <w:numId w:val="1"/>
+        </w:numPr>
+      </w:pPr>
+      <w:r>
+        <w:t>Yleinen verokanta 25,5 %: Useimmat tavarat ja palvelut (esim. vaatteet, elektroniikka, autot, palvelut).</w:t>
+      </w:r>
+    </w:p>
+    <w:p>
+      <w:pPr>
+        <w:pStyle w:val="Luettelokappale"/>
+        <w:numPr>
+          <w:ilvl w:val="3"/>
+          <w:numId w:val="1"/>
+        </w:numPr>
+      </w:pPr>
+      <w:r>
+        <w:t>Alennettu verokanta 13,5 % (14 % aiemmin): Elintarvikkeet, rehut sekä ravintola- ja ateriapalvelut.</w:t>
+      </w:r>
+    </w:p>
+    <w:p>
+      <w:pPr>
+        <w:pStyle w:val="Luettelokappale"/>
+        <w:numPr>
+          <w:ilvl w:val="3"/>
+          <w:numId w:val="1"/>
+        </w:numPr>
+      </w:pPr>
+      <w:r>
+        <w:lastRenderedPageBreak/>
+        <w:t>Alennettu verokanta 10 %: Kirjat, lääkkeet, liikuntapalvelut, pääsymaksut kulttuuri- ja viihdetilaisuuksiin (esim. elokuvat, konsertit), majoituspalvelut.</w:t>
+      </w:r>
+    </w:p>
+    <w:p>
+      <w:pPr>
+        <w:pStyle w:val="Luettelokappale"/>
+        <w:numPr>
+          <w:ilvl w:val="3"/>
+          <w:numId w:val="1"/>
+        </w:numPr>
+      </w:pPr>
+      <w:r>
+        <w:t>0 % alv (veroton):</w:t>
+      </w:r>
+    </w:p>
+    <w:p>
+      <w:pPr>
+        <w:pStyle w:val="Luettelokappale"/>
+        <w:ind w:left="1080"/>
+      </w:pPr>
       <w:r>
         <w:br/>
       </w:r>
@@ -2411,6 +2461,21 @@
       </w:r>
       <w:r>
         <w:t>yrityksen tai organisaation laskutustoimeksianto</w:t>
+      </w:r>
+    </w:p>
+    <w:p>
+      <w:pPr>
+        <w:pStyle w:val="Luettelokappale"/>
+        <w:numPr>
+          <w:ilvl w:val="2"/>
+          <w:numId w:val="1"/>
+        </w:numPr>
+      </w:pPr>
+      <w:r>
+        <w:t>Suomen ALV-kannat</w:t>
+      </w:r>
+      <w:r>
+        <w:t xml:space="preserve"> kuten kohdassa 2.5</w:t>
       </w:r>
     </w:p>
     <w:sectPr>
@@ -2497,6 +2562,7 @@
           <w:docPartUnique/>
         </w:docPartObj>
       </w:sdtPr>
+      <w:sdtEndPr/>
       <w:sdtContent>
         <w:r>
           <w:fldChar w:fldCharType="begin"/>
@@ -2551,6 +2617,155 @@
 <file path=word/numbering.xml><?xml version="1.0" encoding="utf-8"?>
 <w:numbering xmlns:wpc="http://schemas.microsoft.com/office/word/2010/wordprocessingCanvas" xmlns:cx="http://schemas.microsoft.com/office/drawing/2014/chartex" xmlns:cx1="http://schemas.microsoft.com/office/drawing/2015/9/8/chartex" xmlns:cx2="http://schemas.microsoft.com/office/drawing/2015/10/21/chartex" xmlns:cx3="http://schemas.microsoft.com/office/drawing/2016/5/9/chartex" xmlns:cx4="http://schemas.microsoft.com/office/drawing/2016/5/10/chartex" xmlns:cx5="http://schemas.microsoft.com/office/drawing/2016/5/11/chartex" xmlns:cx6="http://schemas.microsoft.com/office/drawing/2016/5/12/chartex" xmlns:cx7="http://schemas.microsoft.com/office/drawing/2016/5/13/chartex" xmlns:cx8="http://schemas.microsoft.com/office/drawing/2016/5/14/chartex" xmlns:mc="http://schemas.openxmlformats.org/markup-compatibility/2006" xmlns:aink="http://schemas.microsoft.com/office/drawing/2016/ink" xmlns:am3d="http://schemas.microsoft.com/office/drawing/2017/model3d" xmlns:o="urn:schemas-microsoft-com:office:office" xmlns:oel="http://schemas.microsoft.com/office/2019/extlst" xmlns:r="http://schemas.openxmlformats.org/officeDocument/2006/relationships" xmlns:m="http://schemas.openxmlformats.org/officeDocument/2006/math" xmlns:v="urn:schemas-microsoft-com:vml" xmlns:wp14="http://schemas.microsoft.com/office/word/2010/wordprocessingDrawing" xmlns:wp="http://schemas.openxmlformats.org/drawingml/2006/wordprocessingDrawing" xmlns:w10="urn:schemas-microsoft-com:office:word" xmlns:w="http://schemas.openxmlformats.org/wordprocessingml/2006/main" xmlns:w14="http://schemas.microsoft.com/office/word/2010/wordml" xmlns:w15="http://schemas.microsoft.com/office/word/2012/wordml" xmlns:w16cex="http://schemas.microsoft.com/office/word/2018/wordml/cex" xmlns:w16cid="http://schemas.microsoft.com/office/word/2016/wordml/cid" xmlns:w16="http://schemas.microsoft.com/office/word/2018/wordml" xmlns:w16du="http://schemas.microsoft.com/office/word/2023/wordml/word16du" xmlns:w16sdtdh="http://schemas.microsoft.com/office/word/2020/wordml/sdtdatahash" xmlns:w16sdtfl="http://schemas.microsoft.com/office/word/2024/wordml/sdtformatlock" xmlns:w16se="http://schemas.microsoft.com/office/word/2015/wordml/symex" xmlns:wpg="http://schemas.microsoft.com/office/word/2010/wordprocessingGroup" xmlns:wpi="http://schemas.microsoft.com/office/word/2010/wordprocessingInk" xmlns:wne="http://schemas.microsoft.com/office/word/2006/wordml" xmlns:wps="http://schemas.microsoft.com/office/word/2010/wordprocessingShape" mc:Ignorable="w14 w15 w16se w16cid w16 w16cex w16sdtdh w16sdtfl w16du wp14">
   <w:abstractNum w:abstractNumId="0" w15:restartNumberingAfterBreak="0">
+    <w:nsid w:val="1F397C4B"/>
+    <w:multiLevelType w:val="multilevel"/>
+    <w:tmpl w:val="301AAE96"/>
+    <w:lvl w:ilvl="0">
+      <w:start w:val="1"/>
+      <w:numFmt w:val="bullet"/>
+      <w:lvlText w:val=""/>
+      <w:lvlJc w:val="left"/>
+      <w:pPr>
+        <w:tabs>
+          <w:tab w:val="num" w:pos="720"/>
+        </w:tabs>
+        <w:ind w:left="720" w:hanging="360"/>
+      </w:pPr>
+      <w:rPr>
+        <w:rFonts w:ascii="Symbol" w:hAnsi="Symbol" w:hint="default"/>
+        <w:sz w:val="20"/>
+      </w:rPr>
+    </w:lvl>
+    <w:lvl w:ilvl="1" w:tentative="1">
+      <w:start w:val="1"/>
+      <w:numFmt w:val="bullet"/>
+      <w:lvlText w:val="o"/>
+      <w:lvlJc w:val="left"/>
+      <w:pPr>
+        <w:tabs>
+          <w:tab w:val="num" w:pos="1440"/>
+        </w:tabs>
+        <w:ind w:left="1440" w:hanging="360"/>
+      </w:pPr>
+      <w:rPr>
+        <w:rFonts w:ascii="Courier New" w:hAnsi="Courier New" w:hint="default"/>
+        <w:sz w:val="20"/>
+      </w:rPr>
+    </w:lvl>
+    <w:lvl w:ilvl="2" w:tentative="1">
+      <w:start w:val="1"/>
+      <w:numFmt w:val="bullet"/>
+      <w:lvlText w:val=""/>
+      <w:lvlJc w:val="left"/>
+      <w:pPr>
+        <w:tabs>
+          <w:tab w:val="num" w:pos="2160"/>
+        </w:tabs>
+        <w:ind w:left="2160" w:hanging="360"/>
+      </w:pPr>
+      <w:rPr>
+        <w:rFonts w:ascii="Wingdings" w:hAnsi="Wingdings" w:hint="default"/>
+        <w:sz w:val="20"/>
+      </w:rPr>
+    </w:lvl>
+    <w:lvl w:ilvl="3" w:tentative="1">
+      <w:start w:val="1"/>
+      <w:numFmt w:val="bullet"/>
+      <w:lvlText w:val=""/>
+      <w:lvlJc w:val="left"/>
+      <w:pPr>
+        <w:tabs>
+          <w:tab w:val="num" w:pos="2880"/>
+        </w:tabs>
+        <w:ind w:left="2880" w:hanging="360"/>
+      </w:pPr>
+      <w:rPr>
+        <w:rFonts w:ascii="Wingdings" w:hAnsi="Wingdings" w:hint="default"/>
+        <w:sz w:val="20"/>
+      </w:rPr>
+    </w:lvl>
+    <w:lvl w:ilvl="4" w:tentative="1">
+      <w:start w:val="1"/>
+      <w:numFmt w:val="bullet"/>
+      <w:lvlText w:val=""/>
+      <w:lvlJc w:val="left"/>
+      <w:pPr>
+        <w:tabs>
+          <w:tab w:val="num" w:pos="3600"/>
+        </w:tabs>
+        <w:ind w:left="3600" w:hanging="360"/>
+      </w:pPr>
+      <w:rPr>
+        <w:rFonts w:ascii="Wingdings" w:hAnsi="Wingdings" w:hint="default"/>
+        <w:sz w:val="20"/>
+      </w:rPr>
+    </w:lvl>
+    <w:lvl w:ilvl="5" w:tentative="1">
+      <w:start w:val="1"/>
+      <w:numFmt w:val="bullet"/>
+      <w:lvlText w:val=""/>
+      <w:lvlJc w:val="left"/>
+      <w:pPr>
+        <w:tabs>
+          <w:tab w:val="num" w:pos="4320"/>
+        </w:tabs>
+        <w:ind w:left="4320" w:hanging="360"/>
+      </w:pPr>
+      <w:rPr>
+        <w:rFonts w:ascii="Wingdings" w:hAnsi="Wingdings" w:hint="default"/>
+        <w:sz w:val="20"/>
+      </w:rPr>
+    </w:lvl>
+    <w:lvl w:ilvl="6" w:tentative="1">
+      <w:start w:val="1"/>
+      <w:numFmt w:val="bullet"/>
+      <w:lvlText w:val=""/>
+      <w:lvlJc w:val="left"/>
+      <w:pPr>
+        <w:tabs>
+          <w:tab w:val="num" w:pos="5040"/>
+        </w:tabs>
+        <w:ind w:left="5040" w:hanging="360"/>
+      </w:pPr>
+      <w:rPr>
+        <w:rFonts w:ascii="Wingdings" w:hAnsi="Wingdings" w:hint="default"/>
+        <w:sz w:val="20"/>
+      </w:rPr>
+    </w:lvl>
+    <w:lvl w:ilvl="7" w:tentative="1">
+      <w:start w:val="1"/>
+      <w:numFmt w:val="bullet"/>
+      <w:lvlText w:val=""/>
+      <w:lvlJc w:val="left"/>
+      <w:pPr>
+        <w:tabs>
+          <w:tab w:val="num" w:pos="5760"/>
+        </w:tabs>
+        <w:ind w:left="5760" w:hanging="360"/>
+      </w:pPr>
+      <w:rPr>
+        <w:rFonts w:ascii="Wingdings" w:hAnsi="Wingdings" w:hint="default"/>
+        <w:sz w:val="20"/>
+      </w:rPr>
+    </w:lvl>
+    <w:lvl w:ilvl="8" w:tentative="1">
+      <w:start w:val="1"/>
+      <w:numFmt w:val="bullet"/>
+      <w:lvlText w:val=""/>
+      <w:lvlJc w:val="left"/>
+      <w:pPr>
+        <w:tabs>
+          <w:tab w:val="num" w:pos="6480"/>
+        </w:tabs>
+        <w:ind w:left="6480" w:hanging="360"/>
+      </w:pPr>
+      <w:rPr>
+        <w:rFonts w:ascii="Wingdings" w:hAnsi="Wingdings" w:hint="default"/>
+        <w:sz w:val="20"/>
+      </w:rPr>
+    </w:lvl>
+  </w:abstractNum>
+  <w:abstractNum w:abstractNumId="1" w15:restartNumberingAfterBreak="0">
     <w:nsid w:val="4C9B1CAE"/>
     <w:multiLevelType w:val="multilevel"/>
     <w:tmpl w:val="FA10C872"/>
@@ -2649,6 +2864,9 @@
     </w:lvl>
   </w:abstractNum>
   <w:num w:numId="1" w16cid:durableId="1948194020">
+    <w:abstractNumId w:val="1"/>
+  </w:num>
+  <w:num w:numId="2" w16cid:durableId="503058923">
     <w:abstractNumId w:val="0"/>
   </w:num>
 </w:numbering>
@@ -3257,7 +3475,6 @@
   <w:style w:type="character" w:default="1" w:styleId="Kappaleenoletusfontti">
     <w:name w:val="Default Paragraph Font"/>
     <w:uiPriority w:val="1"/>
-    <w:semiHidden/>
     <w:unhideWhenUsed/>
   </w:style>
   <w:style w:type="table" w:default="1" w:styleId="Normaalitaulukko">

</xml_diff>